<commit_message>
Added project skills paragraph
</commit_message>
<xml_diff>
--- a/documentation/working notes/Final Report Working Notes.docx
+++ b/documentation/working notes/Final Report Working Notes.docx
@@ -9,25 +9,75 @@
     </w:p>
     <w:p>
       <w:r>
-        <w:t xml:space="preserve">As the design of the device is centred around scalability, for the purposes of accommodating </w:t>
-      </w:r>
-      <w:r>
-        <w:t xml:space="preserve">future cards which will be made compatible with the device, alongside the code, the hardware will also be made modular such that it will consist of several parts which can be swapped or replaced if future improvements or adjustments to </w:t>
-      </w:r>
-      <w:r>
-        <w:rPr>
-          <w:u w:val="single"/>
-        </w:rPr>
-        <w:t>discrete sections of hardware</w:t>
-      </w:r>
-      <w:r>
-        <w:t xml:space="preserve"> if necessary for the </w:t>
-      </w:r>
-      <w:r>
-        <w:t>purposes</w:t>
-      </w:r>
-      <w:r>
-        <w:t xml:space="preserve"> of scalability.</w:t>
+        <w:t>As the design of the device is centred around scalability, with the intention of accommodating future cards that will be made compatible with the device, the hardware will also be designed to be modular. This will allow individual sections of the hardware to be swapped or replaced as necessary to accommodate future improvements and adjustments, without requiring significant changes to the overall device.</w:t>
+      </w:r>
+    </w:p>
+    <w:p/>
+    <w:p>
+      <w:r>
+        <w:t>2.</w:t>
+      </w:r>
+    </w:p>
+    <w:p>
+      <w:r>
+        <w:t>The project will involve the application of skills and understanding relevant to several fields in engineering</w:t>
+      </w:r>
+      <w:r>
+        <w:t xml:space="preserve">, </w:t>
+      </w:r>
+      <w:r>
+        <w:t xml:space="preserve">including analogue and digital electronic design, </w:t>
+      </w:r>
+      <w:r>
+        <w:t xml:space="preserve">the </w:t>
+      </w:r>
+      <w:r>
+        <w:t>design and use of software for PCB development</w:t>
+      </w:r>
+      <w:r>
+        <w:t xml:space="preserve">, software programming for </w:t>
+      </w:r>
+      <w:r>
+        <w:t>embedded systems and GUI development</w:t>
+      </w:r>
+      <w:r>
+        <w:t>, CAD for mechanical design</w:t>
+      </w:r>
+      <w:r>
+        <w:t xml:space="preserve">, </w:t>
+      </w:r>
+      <w:r>
+        <w:t xml:space="preserve">the </w:t>
+      </w:r>
+      <w:r>
+        <w:t>use</w:t>
+      </w:r>
+      <w:r>
+        <w:t xml:space="preserve"> of industry</w:t>
+      </w:r>
+      <w:r>
+        <w:t>-</w:t>
+      </w:r>
+      <w:r>
+        <w:t>standard communication protocols</w:t>
+      </w:r>
+      <w:r>
+        <w:t xml:space="preserve">, and </w:t>
+      </w:r>
+      <w:r>
+        <w:t>the utilisation</w:t>
+      </w:r>
+      <w:r>
+        <w:t xml:space="preserve"> company</w:t>
+      </w:r>
+      <w:r>
+        <w:t>-</w:t>
+      </w:r>
+      <w:r>
+        <w:t xml:space="preserve">specific APIs </w:t>
+      </w:r>
+      <w:r>
+        <w:t xml:space="preserve">to alter hardware states on the modules under test. </w:t>
       </w:r>
     </w:p>
     <w:sectPr>
@@ -643,7 +693,6 @@
   <w:style w:type="character" w:default="1" w:styleId="DefaultParagraphFont">
     <w:name w:val="Default Paragraph Font"/>
     <w:uiPriority w:val="1"/>
-    <w:semiHidden/>
     <w:unhideWhenUsed/>
   </w:style>
   <w:style w:type="table" w:default="1" w:styleId="TableNormal">

</xml_diff>

<commit_message>
minor changes within files
</commit_message>
<xml_diff>
--- a/documentation/working notes/Final Report Working Notes.docx
+++ b/documentation/working notes/Final Report Working Notes.docx
@@ -16,6 +16,9 @@
     <w:p>
       <w:r>
         <w:t>2.</w:t>
+      </w:r>
+      <w:r>
+        <w:t xml:space="preserve"> Project Skills</w:t>
       </w:r>
     </w:p>
     <w:p>
@@ -693,6 +696,7 @@
   <w:style w:type="character" w:default="1" w:styleId="DefaultParagraphFont">
     <w:name w:val="Default Paragraph Font"/>
     <w:uiPriority w:val="1"/>
+    <w:semiHidden/>
     <w:unhideWhenUsed/>
   </w:style>
   <w:style w:type="table" w:default="1" w:styleId="TableNormal">

</xml_diff>